<commit_message>
Update ALEX JEREMIE Cahier de charges Projet IA V1.docx
</commit_message>
<xml_diff>
--- a/PROJET/ALEX JEREMIE Cahier de charges Projet IA V1.docx
+++ b/PROJET/ALEX JEREMIE Cahier de charges Projet IA V1.docx
@@ -486,6 +486,7 @@
           <w:docPartUnique/>
         </w:docPartObj>
       </w:sdtPr>
+      <w:sdtEndPr/>
       <w:sdtContent>
         <w:p>
           <w:pPr>
@@ -5582,6 +5583,13 @@
               </w:rPr>
               <w:t xml:space="preserve"> </w:t>
             </w:r>
+            <w:r>
+              <w:rPr>
+                <w:sz w:val="19"/>
+                <w:lang w:val="fr-CA"/>
+              </w:rPr>
+              <w:t>https://github.com/seguinx/Projet_Pr-diction_Avion-_retard</w:t>
+            </w:r>
           </w:p>
         </w:tc>
       </w:tr>
@@ -5750,26 +5758,20 @@
     </w:p>
     <w:p>
       <w:pPr>
+        <w:spacing w:after="80"/>
+        <w:rPr>
+          <w:lang w:val="fr-CA"/>
+        </w:rPr>
+      </w:pPr>
+    </w:p>
+    <w:p>
+      <w:pPr>
         <w:spacing w:after="40"/>
-        <w:rPr>
-          <w:lang w:val="fr-CA"/>
-        </w:rPr>
-      </w:pPr>
-      <w:r>
         <w:rPr>
           <w:sz w:val="18"/>
           <w:szCs w:val="18"/>
           <w:lang w:val="fr-CA"/>
         </w:rPr>
-        <w:t>.</w:t>
-      </w:r>
-    </w:p>
-    <w:p>
-      <w:pPr>
-        <w:spacing w:after="40"/>
-        <w:rPr>
-          <w:lang w:val="fr-CA"/>
-        </w:rPr>
       </w:pPr>
       <w:r>
         <w:rPr>
@@ -5777,32 +5779,18 @@
           <w:szCs w:val="18"/>
           <w:lang w:val="fr-CA"/>
         </w:rPr>
-        <w:t>.</w:t>
-      </w:r>
-    </w:p>
-    <w:p>
-      <w:pPr>
-        <w:spacing w:after="40"/>
-        <w:rPr>
-          <w:lang w:val="fr-CA"/>
-        </w:rPr>
-      </w:pPr>
+        <w:t xml:space="preserve">L’entreprise fictive se nomme </w:t>
+      </w:r>
+      <w:proofErr w:type="spellStart"/>
       <w:r>
         <w:rPr>
           <w:sz w:val="18"/>
           <w:szCs w:val="18"/>
           <w:lang w:val="fr-CA"/>
         </w:rPr>
-        <w:t>.</w:t>
-      </w:r>
-    </w:p>
-    <w:p>
-      <w:pPr>
-        <w:spacing w:after="40"/>
-        <w:rPr>
-          <w:lang w:val="fr-CA"/>
-        </w:rPr>
-      </w:pPr>
+        <w:t>Volarus</w:t>
+      </w:r>
+      <w:proofErr w:type="spellEnd"/>
       <w:r>
         <w:rPr>
           <w:sz w:val="18"/>
@@ -5824,6 +5812,80 @@
     </w:p>
     <w:p>
       <w:pPr>
+        <w:spacing w:after="40"/>
+        <w:rPr>
+          <w:sz w:val="18"/>
+          <w:szCs w:val="18"/>
+          <w:lang w:val="fr-CA"/>
+        </w:rPr>
+      </w:pPr>
+      <w:r>
+        <w:rPr>
+          <w:sz w:val="18"/>
+          <w:szCs w:val="18"/>
+          <w:lang w:val="fr-CA"/>
+        </w:rPr>
+        <w:t>Elle aura besoin de notre aide afin de concevoir un modèle d’IA capable de prédire quels vols seront en retard et, lorsqu’un retard est prévu, d’estimer sa durée en minutes.</w:t>
+      </w:r>
+    </w:p>
+    <w:p>
+      <w:pPr>
+        <w:spacing w:after="40"/>
+        <w:rPr>
+          <w:sz w:val="18"/>
+          <w:szCs w:val="18"/>
+          <w:lang w:val="fr-CA"/>
+        </w:rPr>
+      </w:pPr>
+    </w:p>
+    <w:p>
+      <w:pPr>
+        <w:spacing w:after="40"/>
+        <w:rPr>
+          <w:sz w:val="18"/>
+          <w:szCs w:val="18"/>
+          <w:lang w:val="fr-CA"/>
+        </w:rPr>
+      </w:pPr>
+      <w:r>
+        <w:rPr>
+          <w:sz w:val="18"/>
+          <w:szCs w:val="18"/>
+          <w:lang w:val="fr-CA"/>
+        </w:rPr>
+        <w:t xml:space="preserve">Le problème étudié pourrait avoir un impact important sur l’efficacité de la gestion des vols, notamment en permettant d’anticiper les retards, d’analyser leurs causes et éventuellement de contribuer à réduire leur durée. Le projet pourrait également permettre à </w:t>
+      </w:r>
+      <w:proofErr w:type="spellStart"/>
+      <w:r>
+        <w:rPr>
+          <w:sz w:val="18"/>
+          <w:szCs w:val="18"/>
+          <w:lang w:val="fr-CA"/>
+        </w:rPr>
+        <w:t>Volarus</w:t>
+      </w:r>
+      <w:proofErr w:type="spellEnd"/>
+      <w:r>
+        <w:rPr>
+          <w:sz w:val="18"/>
+          <w:szCs w:val="18"/>
+          <w:lang w:val="fr-CA"/>
+        </w:rPr>
+        <w:t xml:space="preserve"> de mieux informer ses clients et de les aider à anticiper les retards de leurs vols.</w:t>
+      </w:r>
+    </w:p>
+    <w:p>
+      <w:pPr>
+        <w:spacing w:after="40"/>
+        <w:rPr>
+          <w:sz w:val="18"/>
+          <w:szCs w:val="18"/>
+          <w:lang w:val="fr-CA"/>
+        </w:rPr>
+      </w:pPr>
+    </w:p>
+    <w:p>
+      <w:pPr>
         <w:pStyle w:val="Titre2"/>
         <w:spacing w:before="100" w:after="80"/>
         <w:rPr>
@@ -5873,16 +5935,41 @@
       <w:pPr>
         <w:spacing w:after="40"/>
         <w:rPr>
-          <w:lang w:val="fr-CA"/>
-        </w:rPr>
-      </w:pPr>
-      <w:r>
-        <w:rPr>
           <w:sz w:val="18"/>
           <w:szCs w:val="18"/>
           <w:lang w:val="fr-CA"/>
         </w:rPr>
-        <w:t>.</w:t>
+      </w:pPr>
+    </w:p>
+    <w:p>
+      <w:pPr>
+        <w:pStyle w:val="Titre2"/>
+        <w:spacing w:before="100" w:after="80"/>
+        <w:rPr>
+          <w:lang w:val="fr-CA"/>
+        </w:rPr>
+      </w:pPr>
+      <w:bookmarkStart w:id="7" w:name="_Toc226814175"/>
+      <w:r>
+        <w:rPr>
+          <w:lang w:val="fr-CA"/>
+        </w:rPr>
+        <w:t>1.3 Problématique métier</w:t>
+      </w:r>
+      <w:bookmarkEnd w:id="7"/>
+    </w:p>
+    <w:p>
+      <w:pPr>
+        <w:spacing w:after="80"/>
+        <w:rPr>
+          <w:lang w:val="fr-CA"/>
+        </w:rPr>
+      </w:pPr>
+      <w:r>
+        <w:rPr>
+          <w:lang w:val="fr-CA"/>
+        </w:rPr>
+        <w:t>Formulez clairement le problème que le projet cherche à résoudre. Une bonne problématique permet de comprendre qui rencontre quel problème, dans quel contexte, et comment une solution IA pourrait aider.</w:t>
       </w:r>
     </w:p>
     <w:p>
@@ -5937,10 +6024,42 @@
       <w:pPr>
         <w:spacing w:after="40"/>
         <w:rPr>
+          <w:lang w:val="fr-CA"/>
+        </w:rPr>
+      </w:pPr>
+      <w:r>
+        <w:rPr>
           <w:sz w:val="18"/>
           <w:szCs w:val="18"/>
           <w:lang w:val="fr-CA"/>
         </w:rPr>
+        <w:t>.</w:t>
+      </w:r>
+    </w:p>
+    <w:p>
+      <w:pPr>
+        <w:spacing w:after="40"/>
+        <w:rPr>
+          <w:lang w:val="fr-CA"/>
+        </w:rPr>
+      </w:pPr>
+      <w:r>
+        <w:rPr>
+          <w:sz w:val="18"/>
+          <w:szCs w:val="18"/>
+          <w:lang w:val="fr-CA"/>
+        </w:rPr>
+        <w:t>.</w:t>
+      </w:r>
+    </w:p>
+    <w:p>
+      <w:pPr>
+        <w:spacing w:after="40"/>
+        <w:rPr>
+          <w:sz w:val="18"/>
+          <w:szCs w:val="18"/>
+          <w:lang w:val="fr-CA"/>
+        </w:rPr>
       </w:pPr>
     </w:p>
     <w:p>
@@ -5951,14 +6070,14 @@
           <w:lang w:val="fr-CA"/>
         </w:rPr>
       </w:pPr>
-      <w:bookmarkStart w:id="7" w:name="_Toc226814175"/>
-      <w:r>
-        <w:rPr>
-          <w:lang w:val="fr-CA"/>
-        </w:rPr>
-        <w:t>1.3 Problématique métier</w:t>
-      </w:r>
-      <w:bookmarkEnd w:id="7"/>
+      <w:bookmarkStart w:id="8" w:name="_Toc652179442"/>
+      <w:r>
+        <w:rPr>
+          <w:lang w:val="fr-CA"/>
+        </w:rPr>
+        <w:t>1.4 Objectif du projet</w:t>
+      </w:r>
+      <w:bookmarkEnd w:id="8"/>
     </w:p>
     <w:p>
       <w:pPr>
@@ -5971,7 +6090,24 @@
         <w:rPr>
           <w:lang w:val="fr-CA"/>
         </w:rPr>
-        <w:t>Formulez clairement le problème que le projet cherche à résoudre. Une bonne problématique permet de comprendre qui rencontre quel problème, dans quel contexte, et comment une solution IA pourrait aider.</w:t>
+        <w:t>Décrivez ce que votre solution doit permettre de faire. Par exemple : prédire une valeur, classifier une observation, détecter une situation, identifier une anomalie ou regrouper des profils.</w:t>
+      </w:r>
+    </w:p>
+    <w:p>
+      <w:pPr>
+        <w:spacing w:after="80"/>
+        <w:rPr>
+          <w:lang w:val="fr-CA"/>
+        </w:rPr>
+      </w:pPr>
+      <w:r>
+        <w:rPr>
+          <w:b/>
+          <w:bCs/>
+          <w:lang w:val="fr-CA"/>
+        </w:rPr>
+        <w:lastRenderedPageBreak/>
+        <w:t>Objectif général :</w:t>
       </w:r>
     </w:p>
     <w:p>
@@ -5987,144 +6123,6 @@
           <w:szCs w:val="18"/>
           <w:lang w:val="fr-CA"/>
         </w:rPr>
-        <w:t>.</w:t>
-      </w:r>
-    </w:p>
-    <w:p>
-      <w:pPr>
-        <w:spacing w:after="40"/>
-        <w:rPr>
-          <w:lang w:val="fr-CA"/>
-        </w:rPr>
-      </w:pPr>
-      <w:r>
-        <w:rPr>
-          <w:sz w:val="18"/>
-          <w:szCs w:val="18"/>
-          <w:lang w:val="fr-CA"/>
-        </w:rPr>
-        <w:t>.</w:t>
-      </w:r>
-    </w:p>
-    <w:p>
-      <w:pPr>
-        <w:spacing w:after="40"/>
-        <w:rPr>
-          <w:lang w:val="fr-CA"/>
-        </w:rPr>
-      </w:pPr>
-      <w:r>
-        <w:rPr>
-          <w:sz w:val="18"/>
-          <w:szCs w:val="18"/>
-          <w:lang w:val="fr-CA"/>
-        </w:rPr>
-        <w:t>.</w:t>
-      </w:r>
-    </w:p>
-    <w:p>
-      <w:pPr>
-        <w:spacing w:after="40"/>
-        <w:rPr>
-          <w:lang w:val="fr-CA"/>
-        </w:rPr>
-      </w:pPr>
-      <w:r>
-        <w:rPr>
-          <w:sz w:val="18"/>
-          <w:szCs w:val="18"/>
-          <w:lang w:val="fr-CA"/>
-        </w:rPr>
-        <w:t>.</w:t>
-      </w:r>
-    </w:p>
-    <w:p>
-      <w:pPr>
-        <w:spacing w:after="40"/>
-        <w:rPr>
-          <w:lang w:val="fr-CA"/>
-        </w:rPr>
-      </w:pPr>
-      <w:r>
-        <w:rPr>
-          <w:sz w:val="18"/>
-          <w:szCs w:val="18"/>
-          <w:lang w:val="fr-CA"/>
-        </w:rPr>
-        <w:t>.</w:t>
-      </w:r>
-    </w:p>
-    <w:p>
-      <w:pPr>
-        <w:spacing w:after="40"/>
-        <w:rPr>
-          <w:sz w:val="18"/>
-          <w:szCs w:val="18"/>
-          <w:lang w:val="fr-CA"/>
-        </w:rPr>
-      </w:pPr>
-    </w:p>
-    <w:p>
-      <w:pPr>
-        <w:pStyle w:val="Titre2"/>
-        <w:spacing w:before="100" w:after="80"/>
-        <w:rPr>
-          <w:lang w:val="fr-CA"/>
-        </w:rPr>
-      </w:pPr>
-      <w:bookmarkStart w:id="8" w:name="_Toc652179442"/>
-      <w:r>
-        <w:rPr>
-          <w:lang w:val="fr-CA"/>
-        </w:rPr>
-        <w:t>1.4 Objectif du projet</w:t>
-      </w:r>
-      <w:bookmarkEnd w:id="8"/>
-    </w:p>
-    <w:p>
-      <w:pPr>
-        <w:spacing w:after="80"/>
-        <w:rPr>
-          <w:lang w:val="fr-CA"/>
-        </w:rPr>
-      </w:pPr>
-      <w:r>
-        <w:rPr>
-          <w:lang w:val="fr-CA"/>
-        </w:rPr>
-        <w:t>Décrivez ce que votre solution doit permettre de faire. Par exemple : prédire une valeur, classifier une observation, détecter une situation, identifier une anomalie ou regrouper des profils.</w:t>
-      </w:r>
-    </w:p>
-    <w:p>
-      <w:pPr>
-        <w:spacing w:after="80"/>
-        <w:rPr>
-          <w:lang w:val="fr-CA"/>
-        </w:rPr>
-      </w:pPr>
-      <w:r>
-        <w:rPr>
-          <w:b/>
-          <w:bCs/>
-          <w:lang w:val="fr-CA"/>
-        </w:rPr>
-        <w:t>Objectif général :</w:t>
-      </w:r>
-    </w:p>
-    <w:p>
-      <w:pPr>
-        <w:spacing w:after="40"/>
-        <w:rPr>
-          <w:lang w:val="fr-CA"/>
-        </w:rPr>
-      </w:pPr>
-      <w:r>
-        <w:rPr>
-          <w:sz w:val="18"/>
-          <w:szCs w:val="18"/>
-          <w:lang w:val="fr-CA"/>
-        </w:rPr>
-        <w:lastRenderedPageBreak/>
         <w:t>.</w:t>
       </w:r>
     </w:p>
@@ -6896,6 +6894,7 @@
           <w:szCs w:val="18"/>
           <w:lang w:val="fr-CA"/>
         </w:rPr>
+        <w:lastRenderedPageBreak/>
         <w:t>.</w:t>
       </w:r>
     </w:p>
@@ -6912,7 +6911,6 @@
           <w:szCs w:val="18"/>
           <w:lang w:val="fr-CA"/>
         </w:rPr>
-        <w:lastRenderedPageBreak/>
         <w:t>.</w:t>
       </w:r>
     </w:p>
@@ -10330,17 +10328,8 @@
                 <w:b/>
                 <w:sz w:val="19"/>
               </w:rPr>
-              <w:t xml:space="preserve"> </w:t>
-            </w:r>
-            <w:proofErr w:type="spellStart"/>
-            <w:r>
-              <w:rPr>
-                <w:b/>
-                <w:sz w:val="19"/>
-              </w:rPr>
-              <w:t>prévue</w:t>
-            </w:r>
-            <w:proofErr w:type="spellEnd"/>
+              <w:t xml:space="preserve"> prévue</w:t>
+            </w:r>
           </w:p>
         </w:tc>
         <w:tc>
@@ -12308,33 +12297,8 @@
                 <w:b/>
                 <w:sz w:val="19"/>
               </w:rPr>
-              <w:t xml:space="preserve"> / </w:t>
-            </w:r>
-            <w:proofErr w:type="spellStart"/>
-            <w:r>
-              <w:rPr>
-                <w:b/>
-                <w:sz w:val="19"/>
-              </w:rPr>
-              <w:t>effet</w:t>
-            </w:r>
-            <w:proofErr w:type="spellEnd"/>
-            <w:r>
-              <w:rPr>
-                <w:b/>
-                <w:sz w:val="19"/>
-              </w:rPr>
-              <w:t xml:space="preserve"> </w:t>
-            </w:r>
-            <w:proofErr w:type="spellStart"/>
-            <w:r>
-              <w:rPr>
-                <w:b/>
-                <w:sz w:val="19"/>
-              </w:rPr>
-              <w:t>obtenu</w:t>
-            </w:r>
-            <w:proofErr w:type="spellEnd"/>
+              <w:t xml:space="preserve"> / effet obtenu</w:t>
+            </w:r>
           </w:p>
         </w:tc>
       </w:tr>
@@ -13698,39 +13662,7 @@
                 <w:b/>
                 <w:sz w:val="19"/>
               </w:rPr>
-              <w:t xml:space="preserve"> </w:t>
-            </w:r>
-            <w:proofErr w:type="spellStart"/>
-            <w:r>
-              <w:rPr>
-                <w:b/>
-                <w:sz w:val="19"/>
-              </w:rPr>
-              <w:t>ou</w:t>
-            </w:r>
-            <w:proofErr w:type="spellEnd"/>
-            <w:r>
-              <w:rPr>
-                <w:b/>
-                <w:sz w:val="19"/>
-              </w:rPr>
-              <w:t xml:space="preserve"> </w:t>
-            </w:r>
-            <w:proofErr w:type="spellStart"/>
-            <w:r>
-              <w:rPr>
-                <w:b/>
-                <w:sz w:val="19"/>
-              </w:rPr>
-              <w:t>éléments</w:t>
-            </w:r>
-            <w:proofErr w:type="spellEnd"/>
-            <w:r>
-              <w:rPr>
-                <w:b/>
-                <w:sz w:val="19"/>
-              </w:rPr>
-              <w:t xml:space="preserve"> </w:t>
+              <w:t xml:space="preserve"> ou éléments </w:t>
             </w:r>
             <w:proofErr w:type="spellStart"/>
             <w:r>
@@ -14153,17 +14085,8 @@
                 <w:b/>
                 <w:sz w:val="19"/>
               </w:rPr>
-              <w:t xml:space="preserve"> </w:t>
-            </w:r>
-            <w:proofErr w:type="spellStart"/>
-            <w:r>
-              <w:rPr>
-                <w:b/>
-                <w:sz w:val="19"/>
-              </w:rPr>
-              <w:t>observé</w:t>
-            </w:r>
-            <w:proofErr w:type="spellEnd"/>
+              <w:t xml:space="preserve"> observé</w:t>
+            </w:r>
           </w:p>
         </w:tc>
       </w:tr>
@@ -17789,39 +17712,7 @@
                 <w:b/>
                 <w:sz w:val="19"/>
               </w:rPr>
-              <w:t xml:space="preserve"> </w:t>
-            </w:r>
-            <w:proofErr w:type="spellStart"/>
-            <w:r>
-              <w:rPr>
-                <w:b/>
-                <w:sz w:val="19"/>
-              </w:rPr>
-              <w:t>ou</w:t>
-            </w:r>
-            <w:proofErr w:type="spellEnd"/>
-            <w:r>
-              <w:rPr>
-                <w:b/>
-                <w:sz w:val="19"/>
-              </w:rPr>
-              <w:t xml:space="preserve"> </w:t>
-            </w:r>
-            <w:proofErr w:type="spellStart"/>
-            <w:r>
-              <w:rPr>
-                <w:b/>
-                <w:sz w:val="19"/>
-              </w:rPr>
-              <w:t>précaution</w:t>
-            </w:r>
-            <w:proofErr w:type="spellEnd"/>
-            <w:r>
-              <w:rPr>
-                <w:b/>
-                <w:sz w:val="19"/>
-              </w:rPr>
-              <w:t xml:space="preserve"> possible</w:t>
+              <w:t xml:space="preserve"> ou précaution possible</w:t>
             </w:r>
           </w:p>
         </w:tc>

</xml_diff>